<commit_message>
analysed final news analysed
</commit_message>
<xml_diff>
--- a/Zambia_project/results/Zambia Results.docx
+++ b/Zambia_project/results/Zambia Results.docx
@@ -270,10 +270,10 @@
           <w:lang w:val="en-US"/>
         </w:rPr>
         <w:drawing>
-          <wp:inline distT="0" distB="0" distL="0" distR="0" wp14:anchorId="4D8300E5" wp14:editId="43DC814B">
+          <wp:inline distT="0" distB="0" distL="0" distR="0" wp14:anchorId="0CB25A90" wp14:editId="01D6D065">
             <wp:extent cx="5731510" cy="3820795"/>
             <wp:effectExtent l="0" t="0" r="0" b="1905"/>
-            <wp:docPr id="1317854274" name="Picture 7"/>
+            <wp:docPr id="1505213011" name="Picture 1"/>
             <wp:cNvGraphicFramePr>
               <a:graphicFrameLocks xmlns:a="http://schemas.openxmlformats.org/drawingml/2006/main" noChangeAspect="1"/>
             </wp:cNvGraphicFramePr>
@@ -281,7 +281,7 @@
               <a:graphicData uri="http://schemas.openxmlformats.org/drawingml/2006/picture">
                 <pic:pic xmlns:pic="http://schemas.openxmlformats.org/drawingml/2006/picture">
                   <pic:nvPicPr>
-                    <pic:cNvPr id="1317854274" name="Picture 1317854274"/>
+                    <pic:cNvPr id="1505213011" name="Picture 1505213011"/>
                     <pic:cNvPicPr/>
                   </pic:nvPicPr>
                   <pic:blipFill>
@@ -318,7 +318,7 @@
         </w:rPr>
         <w:lastRenderedPageBreak/>
         <w:drawing>
-          <wp:inline distT="0" distB="0" distL="0" distR="0" wp14:anchorId="48D772A7" wp14:editId="21EE0903">
+          <wp:inline distT="0" distB="0" distL="0" distR="0" wp14:anchorId="48D772A7" wp14:editId="6B178F06">
             <wp:extent cx="5731510" cy="3439160"/>
             <wp:effectExtent l="0" t="0" r="0" b="2540"/>
             <wp:docPr id="675608372" name="Picture 8"/>
@@ -590,8 +590,16 @@
         <w:rPr>
           <w:lang w:val="en-US"/>
         </w:rPr>
-        <w:t>Environmental         1443  16.3</w:t>
-      </w:r>
+        <w:t xml:space="preserve">Environmental         </w:t>
+      </w:r>
+      <w:proofErr w:type="gramStart"/>
+      <w:r>
+        <w:rPr>
+          <w:lang w:val="en-US"/>
+        </w:rPr>
+        <w:t>1443  16.3</w:t>
+      </w:r>
+      <w:proofErr w:type="gramEnd"/>
     </w:p>
     <w:p>
       <w:pPr>
@@ -611,25 +619,35 @@
         </w:rPr>
         <w:t xml:space="preserve">          </w:t>
       </w:r>
+      <w:proofErr w:type="gramStart"/>
       <w:r>
         <w:rPr>
           <w:lang w:val="en-US"/>
         </w:rPr>
         <w:t>4035  45.5</w:t>
       </w:r>
-    </w:p>
-    <w:p>
-      <w:pPr>
-        <w:rPr>
-          <w:lang w:val="en-US"/>
-        </w:rPr>
-      </w:pPr>
-      <w:r>
-        <w:rPr>
-          <w:lang w:val="en-US"/>
-        </w:rPr>
-        <w:t>Governance            3382  38.2</w:t>
-      </w:r>
+      <w:proofErr w:type="gramEnd"/>
+    </w:p>
+    <w:p>
+      <w:pPr>
+        <w:rPr>
+          <w:lang w:val="en-US"/>
+        </w:rPr>
+      </w:pPr>
+      <w:r>
+        <w:rPr>
+          <w:lang w:val="en-US"/>
+        </w:rPr>
+        <w:t xml:space="preserve">Governance            </w:t>
+      </w:r>
+      <w:proofErr w:type="gramStart"/>
+      <w:r>
+        <w:rPr>
+          <w:lang w:val="en-US"/>
+        </w:rPr>
+        <w:t>3382  38.2</w:t>
+      </w:r>
+      <w:proofErr w:type="gramEnd"/>
     </w:p>
     <w:p>
       <w:pPr>
@@ -944,7 +962,21 @@
         <w:rPr>
           <w:lang w:val="en-US"/>
         </w:rPr>
-        <w:t>Business opportunities (local supply chains, services)                                   1307</w:t>
+        <w:t xml:space="preserve">Business opportunities (local supply chains, </w:t>
+      </w:r>
+      <w:proofErr w:type="gramStart"/>
+      <w:r>
+        <w:rPr>
+          <w:lang w:val="en-US"/>
+        </w:rPr>
+        <w:t xml:space="preserve">services)   </w:t>
+      </w:r>
+      <w:proofErr w:type="gramEnd"/>
+      <w:r>
+        <w:rPr>
+          <w:lang w:val="en-US"/>
+        </w:rPr>
+        <w:t xml:space="preserve">                                1307</w:t>
       </w:r>
     </w:p>
     <w:p>
@@ -1048,7 +1080,21 @@
         <w:rPr>
           <w:lang w:val="en-US"/>
         </w:rPr>
-        <w:t>Accidents and fatalities (including structural failures such as tailings dams)            405</w:t>
+        <w:t xml:space="preserve">Accidents and fatalities (including structural failures such as tailings </w:t>
+      </w:r>
+      <w:proofErr w:type="gramStart"/>
+      <w:r>
+        <w:rPr>
+          <w:lang w:val="en-US"/>
+        </w:rPr>
+        <w:t xml:space="preserve">dams)   </w:t>
+      </w:r>
+      <w:proofErr w:type="gramEnd"/>
+      <w:r>
+        <w:rPr>
+          <w:lang w:val="en-US"/>
+        </w:rPr>
+        <w:t xml:space="preserve">         405</w:t>
       </w:r>
     </w:p>
     <w:p>
@@ -1074,7 +1120,21 @@
         <w:rPr>
           <w:lang w:val="en-US"/>
         </w:rPr>
-        <w:t>Human capital development (skills, training, workforce development)                       396</w:t>
+        <w:t xml:space="preserve">Human capital development (skills, training, workforce </w:t>
+      </w:r>
+      <w:proofErr w:type="gramStart"/>
+      <w:r>
+        <w:rPr>
+          <w:lang w:val="en-US"/>
+        </w:rPr>
+        <w:t xml:space="preserve">development)   </w:t>
+      </w:r>
+      <w:proofErr w:type="gramEnd"/>
+      <w:r>
+        <w:rPr>
+          <w:lang w:val="en-US"/>
+        </w:rPr>
+        <w:t xml:space="preserve">                    396</w:t>
       </w:r>
     </w:p>
     <w:p>
@@ -1126,7 +1186,21 @@
         <w:rPr>
           <w:lang w:val="en-US"/>
         </w:rPr>
-        <w:t>Social infrastructure and amenities (education, healthcare, public services, leisure)     329</w:t>
+        <w:t xml:space="preserve">Social infrastructure and amenities (education, healthcare, public services, </w:t>
+      </w:r>
+      <w:proofErr w:type="gramStart"/>
+      <w:r>
+        <w:rPr>
+          <w:lang w:val="en-US"/>
+        </w:rPr>
+        <w:t xml:space="preserve">leisure)   </w:t>
+      </w:r>
+      <w:proofErr w:type="gramEnd"/>
+      <w:r>
+        <w:rPr>
+          <w:lang w:val="en-US"/>
+        </w:rPr>
+        <w:t xml:space="preserve">  329</w:t>
       </w:r>
     </w:p>
     <w:p>
@@ -1465,8 +1539,30 @@
         <w:rPr>
           <w:lang w:val="en-US"/>
         </w:rPr>
-        <w:t>impact_level1_clean  Environmental  Social  Governance</w:t>
-      </w:r>
+        <w:t>impact_level1_</w:t>
+      </w:r>
+      <w:proofErr w:type="gramStart"/>
+      <w:r>
+        <w:rPr>
+          <w:lang w:val="en-US"/>
+        </w:rPr>
+        <w:t>clean  Environmental</w:t>
+      </w:r>
+      <w:proofErr w:type="gramEnd"/>
+      <w:r>
+        <w:rPr>
+          <w:lang w:val="en-US"/>
+        </w:rPr>
+        <w:t xml:space="preserve">  </w:t>
+      </w:r>
+      <w:proofErr w:type="gramStart"/>
+      <w:r>
+        <w:rPr>
+          <w:lang w:val="en-US"/>
+        </w:rPr>
+        <w:t>Social  Governance</w:t>
+      </w:r>
+      <w:proofErr w:type="gramEnd"/>
     </w:p>
     <w:p>
       <w:pPr>
@@ -1779,11 +1875,19 @@
           <w:lang w:val="en-US"/>
         </w:rPr>
       </w:pPr>
-      <w:r>
-        <w:rPr>
-          <w:lang w:val="en-US"/>
-        </w:rPr>
-        <w:t>Chingola                         271</w:t>
+      <w:proofErr w:type="spellStart"/>
+      <w:r>
+        <w:rPr>
+          <w:lang w:val="en-US"/>
+        </w:rPr>
+        <w:t>Chingola</w:t>
+      </w:r>
+      <w:proofErr w:type="spellEnd"/>
+      <w:r>
+        <w:rPr>
+          <w:lang w:val="en-US"/>
+        </w:rPr>
+        <w:t xml:space="preserve">                         271</w:t>
       </w:r>
     </w:p>
     <w:p>
@@ -1818,11 +1922,19 @@
           <w:lang w:val="en-US"/>
         </w:rPr>
       </w:pPr>
-      <w:r>
-        <w:rPr>
-          <w:lang w:val="en-US"/>
-        </w:rPr>
-        <w:t>Chingola, Copperbelt Province     87</w:t>
+      <w:proofErr w:type="spellStart"/>
+      <w:r>
+        <w:rPr>
+          <w:lang w:val="en-US"/>
+        </w:rPr>
+        <w:t>Chingola</w:t>
+      </w:r>
+      <w:proofErr w:type="spellEnd"/>
+      <w:r>
+        <w:rPr>
+          <w:lang w:val="en-US"/>
+        </w:rPr>
+        <w:t>, Copperbelt Province     87</w:t>
       </w:r>
     </w:p>
     <w:p>
@@ -1909,11 +2021,19 @@
           <w:lang w:val="en-US"/>
         </w:rPr>
       </w:pPr>
-      <w:r>
-        <w:rPr>
-          <w:lang w:val="en-US"/>
-        </w:rPr>
-        <w:t>Luanshya                          43</w:t>
+      <w:proofErr w:type="spellStart"/>
+      <w:r>
+        <w:rPr>
+          <w:lang w:val="en-US"/>
+        </w:rPr>
+        <w:t>Luanshya</w:t>
+      </w:r>
+      <w:proofErr w:type="spellEnd"/>
+      <w:r>
+        <w:rPr>
+          <w:lang w:val="en-US"/>
+        </w:rPr>
+        <w:t xml:space="preserve">                          43</w:t>
       </w:r>
     </w:p>
     <w:p>
@@ -1960,8 +2080,30 @@
         <w:rPr>
           <w:lang w:val="en-US"/>
         </w:rPr>
-        <w:t>impact_level1_clean            Environmental  Social  Governance  total</w:t>
-      </w:r>
+        <w:t xml:space="preserve">impact_level1_clean            </w:t>
+      </w:r>
+      <w:proofErr w:type="gramStart"/>
+      <w:r>
+        <w:rPr>
+          <w:lang w:val="en-US"/>
+        </w:rPr>
+        <w:t>Environmental  Social</w:t>
+      </w:r>
+      <w:proofErr w:type="gramEnd"/>
+      <w:r>
+        <w:rPr>
+          <w:lang w:val="en-US"/>
+        </w:rPr>
+        <w:t xml:space="preserve">  </w:t>
+      </w:r>
+      <w:proofErr w:type="gramStart"/>
+      <w:r>
+        <w:rPr>
+          <w:lang w:val="en-US"/>
+        </w:rPr>
+        <w:t>Governance  total</w:t>
+      </w:r>
+      <w:proofErr w:type="gramEnd"/>
     </w:p>
     <w:p>
       <w:pPr>
@@ -2034,11 +2176,19 @@
           <w:lang w:val="en-US"/>
         </w:rPr>
       </w:pPr>
-      <w:r>
-        <w:rPr>
-          <w:lang w:val="en-US"/>
-        </w:rPr>
-        <w:t>Chingola                                  64     115          92    271</w:t>
+      <w:proofErr w:type="spellStart"/>
+      <w:r>
+        <w:rPr>
+          <w:lang w:val="en-US"/>
+        </w:rPr>
+        <w:t>Chingola</w:t>
+      </w:r>
+      <w:proofErr w:type="spellEnd"/>
+      <w:r>
+        <w:rPr>
+          <w:lang w:val="en-US"/>
+        </w:rPr>
+        <w:t xml:space="preserve">                                  64     115          92    271</w:t>
       </w:r>
     </w:p>
     <w:p>
@@ -2073,11 +2223,19 @@
           <w:lang w:val="en-US"/>
         </w:rPr>
       </w:pPr>
-      <w:r>
-        <w:rPr>
-          <w:lang w:val="en-US"/>
-        </w:rPr>
-        <w:t>Chingola, Copperbelt Province             26      36          25     87</w:t>
+      <w:proofErr w:type="spellStart"/>
+      <w:r>
+        <w:rPr>
+          <w:lang w:val="en-US"/>
+        </w:rPr>
+        <w:t>Chingola</w:t>
+      </w:r>
+      <w:proofErr w:type="spellEnd"/>
+      <w:r>
+        <w:rPr>
+          <w:lang w:val="en-US"/>
+        </w:rPr>
+        <w:t>, Copperbelt Province             26      36          25     87</w:t>
       </w:r>
     </w:p>
     <w:p>
@@ -2165,11 +2323,19 @@
           <w:lang w:val="en-US"/>
         </w:rPr>
       </w:pPr>
-      <w:r>
-        <w:rPr>
-          <w:lang w:val="en-US"/>
-        </w:rPr>
-        <w:t>Luanshya                                  10      19          14     43</w:t>
+      <w:proofErr w:type="spellStart"/>
+      <w:r>
+        <w:rPr>
+          <w:lang w:val="en-US"/>
+        </w:rPr>
+        <w:t>Luanshya</w:t>
+      </w:r>
+      <w:proofErr w:type="spellEnd"/>
+      <w:r>
+        <w:rPr>
+          <w:lang w:val="en-US"/>
+        </w:rPr>
+        <w:t xml:space="preserve">                                  10      19          14     43</w:t>
       </w:r>
     </w:p>
     <w:p>
@@ -2275,12 +2441,14 @@
           <w:lang w:val="en-US"/>
         </w:rPr>
       </w:pPr>
+      <w:proofErr w:type="spellStart"/>
       <w:r>
         <w:rPr>
           <w:lang w:val="en-US"/>
         </w:rPr>
         <w:t>mining_company</w:t>
       </w:r>
+      <w:proofErr w:type="spellEnd"/>
     </w:p>
     <w:p>
       <w:pPr>
@@ -2458,11 +2626,19 @@
           <w:lang w:val="en-US"/>
         </w:rPr>
       </w:pPr>
-      <w:r>
-        <w:rPr>
-          <w:lang w:val="en-US"/>
-        </w:rPr>
-        <w:t>KoBold Metals                56</w:t>
+      <w:proofErr w:type="spellStart"/>
+      <w:r>
+        <w:rPr>
+          <w:lang w:val="en-US"/>
+        </w:rPr>
+        <w:t>KoBold</w:t>
+      </w:r>
+      <w:proofErr w:type="spellEnd"/>
+      <w:r>
+        <w:rPr>
+          <w:lang w:val="en-US"/>
+        </w:rPr>
+        <w:t xml:space="preserve"> Metals                56</w:t>
       </w:r>
     </w:p>
     <w:p>
@@ -2518,12 +2694,14 @@
           <w:lang w:val="en-US"/>
         </w:rPr>
       </w:pPr>
+      <w:proofErr w:type="spellStart"/>
       <w:r>
         <w:rPr>
           <w:lang w:val="en-US"/>
         </w:rPr>
         <w:t>mineral_type</w:t>
       </w:r>
+      <w:proofErr w:type="spellEnd"/>
     </w:p>
     <w:p>
       <w:pPr>

</xml_diff>